<commit_message>
Reformat docs: subheadings, monospace code blocks, bullet lists
</commit_message>
<xml_diff>
--- a/docs/CompilerArchitecture.docx
+++ b/docs/CompilerArchitecture.docx
@@ -4,104 +4,364 @@
   <w:body>
     <w:p>
       <w:pPr>
-        <w:pStyle w:val="Heading1"/>
+        <w:keepNext/>
+        <w:spacing w:before="280" w:after="120"/>
       </w:pPr>
       <w:r>
         <w:rPr>
+          <w:rFonts w:ascii="Calibri" w:hAnsi="Calibri"/>
+          <w:b/>
           <w:color w:val="000000"/>
+          <w:sz w:val="36"/>
         </w:rPr>
         <w:t>Compiler Architecture</w:t>
       </w:r>
     </w:p>
     <w:p>
+      <w:pPr>
+        <w:spacing w:after="160" w:before="0" w:lineRule="auto" w:line="276"/>
+        <w:jc w:val="both"/>
+      </w:pPr>
       <w:r>
         <w:rPr>
+          <w:rFonts w:ascii="Calibri" w:hAnsi="Calibri"/>
+          <w:b w:val="0"/>
+          <w:i w:val="0"/>
           <w:color w:val="000000"/>
+          <w:sz w:val="22"/>
         </w:rPr>
-        <w:t>PixLang compiles a .pix source file into a PNG image through a six-phase</w:t>
-        <w:br/>
-        <w:t>pipeline:</w:t>
+        <w:t>PixLang compiles a .pix source file into a PNG image through a six-phase pipeline. Each phase is implemented in its own Python module under src/, and compiler.py wires them together.</w:t>
       </w:r>
     </w:p>
     <w:p>
+      <w:pPr>
+        <w:keepNext/>
+        <w:spacing w:before="200" w:after="120"/>
+      </w:pPr>
       <w:r>
         <w:rPr>
+          <w:rFonts w:ascii="Calibri" w:hAnsi="Calibri"/>
+          <w:b/>
           <w:color w:val="000000"/>
+          <w:sz w:val="26"/>
         </w:rPr>
-        <w:t>Source Code → Lexer → Parser → Semantic Analyser → IR Generator → Optimiser → Code Generator → PNG</w:t>
+        <w:t>Pipeline</w:t>
       </w:r>
     </w:p>
     <w:p>
+      <w:pPr>
+        <w:spacing w:after="0" w:before="0" w:lineRule="auto" w:line="264"/>
+        <w:ind w:left="283"/>
+        <w:shd w:val="clear" w:color="auto" w:fill="F2F2F2"/>
+      </w:pPr>
       <w:r>
         <w:rPr>
+          <w:rFonts w:ascii="Consolas" w:hAnsi="Consolas"/>
           <w:color w:val="000000"/>
+          <w:sz w:val="20"/>
         </w:rPr>
-        <w:t>The Lexer is a hand-written deterministic finite automaton that converts the</w:t>
-        <w:br/>
-        <w:t>input character stream into a list of tokens (keywords, identifiers, integer</w:t>
-        <w:br/>
-        <w:t>and float literals, color literals, strings, operators, and punctuation).</w:t>
-        <w:br/>
-        <w:t>Comments beginning with ';' and whitespace are discarded.</w:t>
+        <w:t>Source Code</w:t>
       </w:r>
     </w:p>
     <w:p>
+      <w:pPr>
+        <w:spacing w:after="0" w:before="0" w:lineRule="auto" w:line="264"/>
+        <w:ind w:left="283"/>
+        <w:shd w:val="clear" w:color="auto" w:fill="F2F2F2"/>
+      </w:pPr>
       <w:r>
         <w:rPr>
+          <w:rFonts w:ascii="Consolas" w:hAnsi="Consolas"/>
           <w:color w:val="000000"/>
+          <w:sz w:val="20"/>
         </w:rPr>
-        <w:t>The Parser is a recursive-descent parser that consumes the token stream and</w:t>
-        <w:br/>
-        <w:t>builds an Abstract Syntax Tree using the node classes defined in ast_nodes.py.</w:t>
-        <w:br/>
-        <w:t>It enforces the grammar of statements, expressions, and control-flow blocks.</w:t>
+        <w:t xml:space="preserve">    -&gt; Lexer            (Phase 1)</w:t>
       </w:r>
     </w:p>
     <w:p>
+      <w:pPr>
+        <w:spacing w:after="0" w:before="0" w:lineRule="auto" w:line="264"/>
+        <w:ind w:left="283"/>
+        <w:shd w:val="clear" w:color="auto" w:fill="F2F2F2"/>
+      </w:pPr>
       <w:r>
         <w:rPr>
+          <w:rFonts w:ascii="Consolas" w:hAnsi="Consolas"/>
           <w:color w:val="000000"/>
+          <w:sz w:val="20"/>
         </w:rPr>
-        <w:t>The Semantic Analyser walks the AST, builds a scoped symbol table, infers</w:t>
-        <w:br/>
-        <w:t>expression types (INT, FLOAT, COLOR, STRING), validates that drawing commands</w:t>
-        <w:br/>
-        <w:t>appear after a CANVAS declaration, and checks palette references.</w:t>
+        <w:t xml:space="preserve">    -&gt; Parser           (Phase 2)</w:t>
       </w:r>
     </w:p>
     <w:p>
+      <w:pPr>
+        <w:spacing w:after="0" w:before="0" w:lineRule="auto" w:line="264"/>
+        <w:ind w:left="283"/>
+        <w:shd w:val="clear" w:color="auto" w:fill="F2F2F2"/>
+      </w:pPr>
       <w:r>
         <w:rPr>
+          <w:rFonts w:ascii="Consolas" w:hAnsi="Consolas"/>
           <w:color w:val="000000"/>
+          <w:sz w:val="20"/>
         </w:rPr>
-        <w:t>The IR Generator lowers the validated AST into Three-Address Code, a flat</w:t>
-        <w:br/>
-        <w:t>linear sequence of simple instructions that resemble assembly. The Optimiser</w:t>
-        <w:br/>
-        <w:t>then performs constant folding (evaluating constant sub-expressions at</w:t>
-        <w:br/>
-        <w:t>compile time) and dead variable elimination (removing temporaries that are</w:t>
-        <w:br/>
-        <w:t>written but never read).</w:t>
+        <w:t xml:space="preserve">    -&gt; Semantic Analyser (Phase 3)</w:t>
       </w:r>
     </w:p>
     <w:p>
+      <w:pPr>
+        <w:spacing w:after="0" w:before="0" w:lineRule="auto" w:line="264"/>
+        <w:ind w:left="283"/>
+        <w:shd w:val="clear" w:color="auto" w:fill="F2F2F2"/>
+      </w:pPr>
       <w:r>
         <w:rPr>
+          <w:rFonts w:ascii="Consolas" w:hAnsi="Consolas"/>
           <w:color w:val="000000"/>
+          <w:sz w:val="20"/>
         </w:rPr>
-        <w:t>Finally, the Code Generator interprets the optimised TAC instructions on a</w:t>
-        <w:br/>
-        <w:t>small virtual machine that drives the Pillow image library to draw rectangles,</w:t>
-        <w:br/>
-        <w:t>circles, lines, and individual pixels onto the canvas, and writes the result</w:t>
-        <w:br/>
-        <w:t>to a PNG file.</w:t>
+        <w:t xml:space="preserve">    -&gt; IR Generator     (Phase 4)</w:t>
+      </w:r>
+    </w:p>
+    <w:p>
+      <w:pPr>
+        <w:spacing w:after="0" w:before="0" w:lineRule="auto" w:line="264"/>
+        <w:ind w:left="283"/>
+        <w:shd w:val="clear" w:color="auto" w:fill="F2F2F2"/>
+      </w:pPr>
+      <w:r>
+        <w:rPr>
+          <w:rFonts w:ascii="Consolas" w:hAnsi="Consolas"/>
+          <w:color w:val="000000"/>
+          <w:sz w:val="20"/>
+        </w:rPr>
+        <w:t xml:space="preserve">    -&gt; Optimiser        (Phase 5)</w:t>
+      </w:r>
+    </w:p>
+    <w:p>
+      <w:pPr>
+        <w:spacing w:after="0" w:before="0" w:lineRule="auto" w:line="264"/>
+        <w:ind w:left="283"/>
+        <w:shd w:val="clear" w:color="auto" w:fill="F2F2F2"/>
+      </w:pPr>
+      <w:r>
+        <w:rPr>
+          <w:rFonts w:ascii="Consolas" w:hAnsi="Consolas"/>
+          <w:color w:val="000000"/>
+          <w:sz w:val="20"/>
+        </w:rPr>
+        <w:t xml:space="preserve">    -&gt; Code Generator   (Phase 6)</w:t>
+      </w:r>
+    </w:p>
+    <w:p>
+      <w:pPr>
+        <w:spacing w:after="0" w:before="0" w:lineRule="auto" w:line="264"/>
+        <w:ind w:left="283"/>
+        <w:shd w:val="clear" w:color="auto" w:fill="F2F2F2"/>
+      </w:pPr>
+      <w:r>
+        <w:rPr>
+          <w:rFonts w:ascii="Consolas" w:hAnsi="Consolas"/>
+          <w:color w:val="000000"/>
+          <w:sz w:val="20"/>
+        </w:rPr>
+        <w:t xml:space="preserve">    -&gt; output.png</w:t>
+      </w:r>
+    </w:p>
+    <w:p>
+      <w:pPr>
+        <w:spacing w:after="40"/>
+      </w:pPr>
+    </w:p>
+    <w:p>
+      <w:pPr>
+        <w:keepNext/>
+        <w:spacing w:before="200" w:after="120"/>
+      </w:pPr>
+      <w:r>
+        <w:rPr>
+          <w:rFonts w:ascii="Calibri" w:hAnsi="Calibri"/>
+          <w:b/>
+          <w:color w:val="000000"/>
+          <w:sz w:val="26"/>
+        </w:rPr>
+        <w:t>Phase 1: Lexer</w:t>
+      </w:r>
+    </w:p>
+    <w:p>
+      <w:pPr>
+        <w:spacing w:after="160" w:before="0" w:lineRule="auto" w:line="276"/>
+        <w:jc w:val="both"/>
+      </w:pPr>
+      <w:r>
+        <w:rPr>
+          <w:rFonts w:ascii="Calibri" w:hAnsi="Calibri"/>
+          <w:b w:val="0"/>
+          <w:i w:val="0"/>
+          <w:color w:val="000000"/>
+          <w:sz w:val="22"/>
+        </w:rPr>
+        <w:t>A hand-written deterministic finite automaton converts the input character stream into a list of tokens (keywords, identifiers, integer and float literals, color literals, strings, operators, and punctuation). Comments beginning with ';' and whitespace are discarded.</w:t>
+      </w:r>
+    </w:p>
+    <w:p>
+      <w:pPr>
+        <w:keepNext/>
+        <w:spacing w:before="200" w:after="120"/>
+      </w:pPr>
+      <w:r>
+        <w:rPr>
+          <w:rFonts w:ascii="Calibri" w:hAnsi="Calibri"/>
+          <w:b/>
+          <w:color w:val="000000"/>
+          <w:sz w:val="26"/>
+        </w:rPr>
+        <w:t>Phase 2: Parser</w:t>
+      </w:r>
+    </w:p>
+    <w:p>
+      <w:pPr>
+        <w:spacing w:after="160" w:before="0" w:lineRule="auto" w:line="276"/>
+        <w:jc w:val="both"/>
+      </w:pPr>
+      <w:r>
+        <w:rPr>
+          <w:rFonts w:ascii="Calibri" w:hAnsi="Calibri"/>
+          <w:b w:val="0"/>
+          <w:i w:val="0"/>
+          <w:color w:val="000000"/>
+          <w:sz w:val="22"/>
+        </w:rPr>
+        <w:t>A recursive-descent parser consumes the token stream and builds an Abstract Syntax Tree using the node classes defined in ast_nodes.py. The parser enforces the grammar of statements, expressions, and control-flow blocks, and reports the line and column of any syntax error.</w:t>
+      </w:r>
+    </w:p>
+    <w:p>
+      <w:pPr>
+        <w:keepNext/>
+        <w:spacing w:before="200" w:after="120"/>
+      </w:pPr>
+      <w:r>
+        <w:rPr>
+          <w:rFonts w:ascii="Calibri" w:hAnsi="Calibri"/>
+          <w:b/>
+          <w:color w:val="000000"/>
+          <w:sz w:val="26"/>
+        </w:rPr>
+        <w:t>Phase 3: Semantic Analyser</w:t>
+      </w:r>
+    </w:p>
+    <w:p>
+      <w:pPr>
+        <w:spacing w:after="160" w:before="0" w:lineRule="auto" w:line="276"/>
+        <w:jc w:val="both"/>
+      </w:pPr>
+      <w:r>
+        <w:rPr>
+          <w:rFonts w:ascii="Calibri" w:hAnsi="Calibri"/>
+          <w:b w:val="0"/>
+          <w:i w:val="0"/>
+          <w:color w:val="000000"/>
+          <w:sz w:val="22"/>
+        </w:rPr>
+        <w:t>Walks the AST, builds a scoped symbol table, infers expression types (INT, FLOAT, COLOR, STRING), validates that drawing commands appear after a CANVAS declaration, and checks palette references. Each lexical scope corresponds to a LOOP or IF block.</w:t>
+      </w:r>
+    </w:p>
+    <w:p>
+      <w:pPr>
+        <w:keepNext/>
+        <w:spacing w:before="200" w:after="120"/>
+      </w:pPr>
+      <w:r>
+        <w:rPr>
+          <w:rFonts w:ascii="Calibri" w:hAnsi="Calibri"/>
+          <w:b/>
+          <w:color w:val="000000"/>
+          <w:sz w:val="26"/>
+        </w:rPr>
+        <w:t>Phase 4: IR Generator</w:t>
+      </w:r>
+    </w:p>
+    <w:p>
+      <w:pPr>
+        <w:spacing w:after="160" w:before="0" w:lineRule="auto" w:line="276"/>
+        <w:jc w:val="both"/>
+      </w:pPr>
+      <w:r>
+        <w:rPr>
+          <w:rFonts w:ascii="Calibri" w:hAnsi="Calibri"/>
+          <w:b w:val="0"/>
+          <w:i w:val="0"/>
+          <w:color w:val="000000"/>
+          <w:sz w:val="22"/>
+        </w:rPr>
+        <w:t>Lowers the validated AST into Three-Address Code, a flat linear sequence of simple instructions that resemble assembly. Control flow is encoded with explicit labels and conditional jumps.</w:t>
+      </w:r>
+    </w:p>
+    <w:p>
+      <w:pPr>
+        <w:keepNext/>
+        <w:spacing w:before="200" w:after="120"/>
+      </w:pPr>
+      <w:r>
+        <w:rPr>
+          <w:rFonts w:ascii="Calibri" w:hAnsi="Calibri"/>
+          <w:b/>
+          <w:color w:val="000000"/>
+          <w:sz w:val="26"/>
+        </w:rPr>
+        <w:t>Phase 5: Optimiser</w:t>
+      </w:r>
+    </w:p>
+    <w:p>
+      <w:pPr>
+        <w:spacing w:after="160" w:before="0" w:lineRule="auto" w:line="276"/>
+        <w:jc w:val="both"/>
+      </w:pPr>
+      <w:r>
+        <w:rPr>
+          <w:rFonts w:ascii="Calibri" w:hAnsi="Calibri"/>
+          <w:b w:val="0"/>
+          <w:i w:val="0"/>
+          <w:color w:val="000000"/>
+          <w:sz w:val="22"/>
+        </w:rPr>
+        <w:t>Performs two passes on the TAC: constant folding, which evaluates constant sub-expressions at compile time, and dead variable elimination, which removes temporaries that are written but never read. The number of instructions before and after optimisation is reported with the --debug flag.</w:t>
+      </w:r>
+    </w:p>
+    <w:p>
+      <w:pPr>
+        <w:keepNext/>
+        <w:spacing w:before="200" w:after="120"/>
+      </w:pPr>
+      <w:r>
+        <w:rPr>
+          <w:rFonts w:ascii="Calibri" w:hAnsi="Calibri"/>
+          <w:b/>
+          <w:color w:val="000000"/>
+          <w:sz w:val="26"/>
+        </w:rPr>
+        <w:t>Phase 6: Code Generator</w:t>
+      </w:r>
+    </w:p>
+    <w:p>
+      <w:pPr>
+        <w:spacing w:after="160" w:before="0" w:lineRule="auto" w:line="276"/>
+        <w:jc w:val="both"/>
+      </w:pPr>
+      <w:r>
+        <w:rPr>
+          <w:rFonts w:ascii="Calibri" w:hAnsi="Calibri"/>
+          <w:b w:val="0"/>
+          <w:i w:val="0"/>
+          <w:color w:val="000000"/>
+          <w:sz w:val="22"/>
+        </w:rPr>
+        <w:t>Interprets the optimised TAC instructions on a small virtual machine that drives the Pillow image library. Drawing instructions place rectangles, circles, lines, and individual pixels onto the canvas; the SAVE instruction writes the result to a PNG file.</w:t>
       </w:r>
     </w:p>
     <w:sectPr>
       <w:pgSz w:w="12240" w:h="15840"/>
-      <w:pgMar w:top="1440" w:right="1800" w:bottom="1440" w:left="1800" w:header="720" w:footer="720" w:gutter="0"/>
+      <w:pgMar w:top="1417" w:right="1417" w:bottom="1417" w:left="1417" w:header="720" w:footer="720" w:gutter="0"/>
       <w:cols w:space="720"/>
       <w:docGrid w:linePitch="360"/>
     </w:sectPr>

</xml_diff>

<commit_message>
Add clickable GitHub repo link below the title of every doc
</commit_message>
<xml_diff>
--- a/docs/CompilerArchitecture.docx
+++ b/docs/CompilerArchitecture.docx
@@ -16,6 +16,31 @@
         </w:rPr>
         <w:t>Compiler Architecture</w:t>
       </w:r>
+    </w:p>
+    <w:p>
+      <w:pPr>
+        <w:spacing w:after="200"/>
+      </w:pPr>
+      <w:r>
+        <w:rPr>
+          <w:rFonts w:ascii="Calibri" w:hAnsi="Calibri"/>
+          <w:b/>
+          <w:color w:val="000000"/>
+          <w:sz w:val="22"/>
+        </w:rPr>
+        <w:t xml:space="preserve">Project Repository: </w:t>
+      </w:r>
+      <w:hyperlink r:id="rId9">
+        <w:r>
+          <w:rPr>
+            <w:rFonts w:ascii="Calibri" w:hAnsi="Calibri"/>
+            <w:sz w:val="22"/>
+            <w:color w:val="0563C1"/>
+            <w:u w:val="single"/>
+          </w:rPr>
+          <w:t>https://github.com/MuhammadMehroz786/Pixel-Lang</w:t>
+        </w:r>
+      </w:hyperlink>
     </w:p>
     <w:p>
       <w:pPr>

</xml_diff>